<commit_message>
chore(docs): update DHF for SequenceQMS import [GBSK-86] (#94)
## Summary
Updates the StrictDoc DHF documentation and export workflow to align
with the SequenceQMS system-of-record naming convention and prepare the
documentation for import.

## Changes
- Renames DHF UIDs and internal document references to use the GBSK
naming convention.
- Rebrands Heracles references to GBSK throughout the documentation.
- Removes draft marking from exported DOCX documents and resets document
revision numbers to 1.
- Fixes the Mermaid diagram, isolates verification output, and corrects
minor document errors.

## Validation
Not provided.

OP#GBSK-86

<!-- gh-aw-workflow-id: pr-standardizer -->

---------

Co-authored-by: Brendan Heinonen <brendan@heinonen.co>
</commit_message>
<xml_diff>
--- a/docs/template.docx
+++ b/docs/template.docx
@@ -1,6 +1,6 @@
 
 <file path=word/document.xml><?xml version="1.0" encoding="utf-8"?>
-<w:document xmlns:wpc="http://schemas.microsoft.com/office/word/2010/wordprocessingCanvas" xmlns:cx="http://schemas.microsoft.com/office/drawing/2014/chartex" xmlns:cx1="http://schemas.microsoft.com/office/drawing/2015/9/8/chartex" xmlns:cx2="http://schemas.microsoft.com/office/drawing/2015/10/21/chartex" xmlns:cx3="http://schemas.microsoft.com/office/drawing/2016/5/9/chartex" xmlns:cx4="http://schemas.microsoft.com/office/drawing/2016/5/10/chartex" xmlns:cx5="http://schemas.microsoft.com/office/drawing/2016/5/11/chartex" xmlns:cx6="http://schemas.microsoft.com/office/drawing/2016/5/12/chartex" xmlns:cx7="http://schemas.microsoft.com/office/drawing/2016/5/13/chartex" xmlns:cx8="http://schemas.microsoft.com/office/drawing/2016/5/14/chartex" xmlns:mc="http://schemas.openxmlformats.org/markup-compatibility/2006" xmlns:aink="http://schemas.microsoft.com/office/drawing/2016/ink" xmlns:am3d="http://schemas.microsoft.com/office/drawing/2017/model3d" xmlns:o="urn:schemas-microsoft-com:office:office" xmlns:oel="http://schemas.microsoft.com/office/2019/extlst" xmlns:r="http://schemas.openxmlformats.org/officeDocument/2006/relationships" xmlns:m="http://schemas.openxmlformats.org/officeDocument/2006/math" xmlns:v="urn:schemas-microsoft-com:vml" xmlns:wp14="http://schemas.microsoft.com/office/word/2010/wordprocessingDrawing" xmlns:wp="http://schemas.openxmlformats.org/drawingml/2006/wordprocessingDrawing" xmlns:w10="urn:schemas-microsoft-com:office:word" xmlns:w="http://schemas.openxmlformats.org/wordprocessingml/2006/main" xmlns:w14="http://schemas.microsoft.com/office/word/2010/wordml" xmlns:w15="http://schemas.microsoft.com/office/word/2012/wordml" xmlns:w16cex="http://schemas.microsoft.com/office/word/2018/wordml/cex" xmlns:w16cid="http://schemas.microsoft.com/office/word/2016/wordml/cid" xmlns:w16="http://schemas.microsoft.com/office/word/2018/wordml" xmlns:w16du="http://schemas.microsoft.com/office/word/2023/wordml/word16du" xmlns:w16sdtdh="http://schemas.microsoft.com/office/word/2020/wordml/sdtdatahash" xmlns:w16sdtfl="http://schemas.microsoft.com/office/word/2024/wordml/sdtformatlock" xmlns:w16se="http://schemas.microsoft.com/office/word/2015/wordml/symex" xmlns:wpg="http://schemas.microsoft.com/office/word/2010/wordprocessingGroup" xmlns:wpi="http://schemas.microsoft.com/office/word/2010/wordprocessingInk" xmlns:wne="http://schemas.microsoft.com/office/word/2006/wordml" xmlns:wps="http://schemas.microsoft.com/office/word/2010/wordprocessingShape" xmlns:a="http://schemas.openxmlformats.org/drawingml/2006/main" xmlns:pic="http://schemas.openxmlformats.org/drawingml/2006/picture" mc:Ignorable="w14 w15 w16se w16cid w16 w16cex w16sdtdh w16sdtfl w16du wp14">
+<w:document xmlns:wpc="http://schemas.microsoft.com/office/word/2010/wordprocessingCanvas" xmlns:cx="http://schemas.microsoft.com/office/drawing/2014/chartex" xmlns:cx1="http://schemas.microsoft.com/office/drawing/2015/9/8/chartex" xmlns:cx2="http://schemas.microsoft.com/office/drawing/2015/10/21/chartex" xmlns:cx3="http://schemas.microsoft.com/office/drawing/2016/5/9/chartex" xmlns:cx4="http://schemas.microsoft.com/office/drawing/2016/5/10/chartex" xmlns:cx5="http://schemas.microsoft.com/office/drawing/2016/5/11/chartex" xmlns:cx6="http://schemas.microsoft.com/office/drawing/2016/5/12/chartex" xmlns:cx7="http://schemas.microsoft.com/office/drawing/2016/5/13/chartex" xmlns:cx8="http://schemas.microsoft.com/office/drawing/2016/5/14/chartex" xmlns:mc="http://schemas.openxmlformats.org/markup-compatibility/2006" xmlns:aink="http://schemas.microsoft.com/office/drawing/2016/ink" xmlns:am3d="http://schemas.microsoft.com/office/drawing/2017/model3d" xmlns:o="urn:schemas-microsoft-com:office:office" xmlns:oel="http://schemas.microsoft.com/office/2019/extlst" xmlns:r="http://schemas.openxmlformats.org/officeDocument/2006/relationships" xmlns:m="http://schemas.openxmlformats.org/officeDocument/2006/math" xmlns:v="urn:schemas-microsoft-com:vml" xmlns:wp14="http://schemas.microsoft.com/office/word/2010/wordprocessingDrawing" xmlns:wp="http://schemas.openxmlformats.org/drawingml/2006/wordprocessingDrawing" xmlns:w10="urn:schemas-microsoft-com:office:word" xmlns:w="http://schemas.openxmlformats.org/wordprocessingml/2006/main" xmlns:w14="http://schemas.microsoft.com/office/word/2010/wordml" xmlns:w15="http://schemas.microsoft.com/office/word/2012/wordml" xmlns:w16cex="http://schemas.microsoft.com/office/word/2018/wordml/cex" xmlns:w16cid="http://schemas.microsoft.com/office/word/2016/wordml/cid" xmlns:w16="http://schemas.microsoft.com/office/word/2018/wordml" xmlns:w16du="http://schemas.microsoft.com/office/word/2023/wordml/word16du" xmlns:w16sdtdh="http://schemas.microsoft.com/office/word/2020/wordml/sdtdatahash" xmlns:w16sdtfl="http://schemas.microsoft.com/office/word/2024/wordml/sdtformatlock" xmlns:w16se="http://schemas.microsoft.com/office/word/2015/wordml/symex" xmlns:wpg="http://schemas.microsoft.com/office/word/2010/wordprocessingGroup" xmlns:wpi="http://schemas.microsoft.com/office/word/2010/wordprocessingInk" xmlns:wne="http://schemas.microsoft.com/office/word/2006/wordml" xmlns:wps="http://schemas.microsoft.com/office/word/2010/wordprocessingShape" mc:Ignorable="w14 w15 w16se w16cid w16 w16cex w16sdtdh w16sdtfl w16du wp14">
   <w:body>
     <w:p/>
     <w:p/>
@@ -9,32 +9,65 @@
       <w:pPr>
         <w:pStyle w:val="Title"/>
       </w:pPr>
+      <w:proofErr w:type="gramStart"/>
       <w:r>
-        <w:t>{{ title }}</w:t>
+        <w:t>{{ title</w:t>
+      </w:r>
+      <w:proofErr w:type="gramEnd"/>
+      <w:r>
+        <w:t xml:space="preserve"> }}</w:t>
       </w:r>
     </w:p>
     <w:p>
       <w:pPr>
         <w:pStyle w:val="Subtitle"/>
       </w:pPr>
+      <w:proofErr w:type="gramStart"/>
       <w:r>
-        <w:t>{{ uid }} Revision {{ rev }}</w:t>
+        <w:t xml:space="preserve">{{ </w:t>
+      </w:r>
+      <w:proofErr w:type="spellStart"/>
+      <w:r>
+        <w:t>uid</w:t>
+      </w:r>
+      <w:proofErr w:type="spellEnd"/>
+      <w:proofErr w:type="gramEnd"/>
+      <w:r>
+        <w:t xml:space="preserve"> }} Revision </w:t>
+      </w:r>
+      <w:proofErr w:type="gramStart"/>
+      <w:r>
+        <w:t>{{ rev</w:t>
+      </w:r>
+      <w:proofErr w:type="gramEnd"/>
+      <w:r>
+        <w:t xml:space="preserve"> }}</w:t>
       </w:r>
     </w:p>
     <w:p>
       <w:pPr>
         <w:pStyle w:val="Subtitle"/>
       </w:pPr>
+      <w:proofErr w:type="gramStart"/>
       <w:r>
-        <w:t>{{ product }}</w:t>
+        <w:t>{{ product</w:t>
+      </w:r>
+      <w:proofErr w:type="gramEnd"/>
+      <w:r>
+        <w:t xml:space="preserve"> }}</w:t>
       </w:r>
     </w:p>
     <w:p>
       <w:pPr>
         <w:pStyle w:val="Date"/>
       </w:pPr>
+      <w:proofErr w:type="gramStart"/>
       <w:r>
-        <w:t>{{ date }}</w:t>
+        <w:t>{{ date</w:t>
+      </w:r>
+      <w:proofErr w:type="gramEnd"/>
+      <w:r>
+        <w:t xml:space="preserve"> }}</w:t>
       </w:r>
     </w:p>
     <w:p>
@@ -51,9 +84,30 @@
       <w:pPr>
         <w:pStyle w:val="BodyText"/>
       </w:pPr>
+      <w:proofErr w:type="gramStart"/>
       <w:r>
         <w:lastRenderedPageBreak/>
-        <w:t>{{ pandoc_body }}</w:t>
+        <w:t xml:space="preserve">{{ </w:t>
+      </w:r>
+      <w:proofErr w:type="spellStart"/>
+      <w:r>
+        <w:t>pandoc</w:t>
+      </w:r>
+      <w:proofErr w:type="gramEnd"/>
+      <w:r>
+        <w:t>_</w:t>
+      </w:r>
+      <w:proofErr w:type="gramStart"/>
+      <w:r>
+        <w:t>body</w:t>
+      </w:r>
+      <w:proofErr w:type="spellEnd"/>
+      <w:r>
+        <w:t xml:space="preserve"> }</w:t>
+      </w:r>
+      <w:proofErr w:type="gramEnd"/>
+      <w:r>
+        <w:t>}</w:t>
       </w:r>
     </w:p>
     <w:p>
@@ -67,6 +121,27 @@
       </w:pPr>
       <w:r>
         <w:t>&lt;end of document&gt;</w:t>
+      </w:r>
+    </w:p>
+    <w:p/>
+    <w:p/>
+    <w:p/>
+    <w:p/>
+    <w:p/>
+    <w:p/>
+    <w:p/>
+    <w:p/>
+    <w:p/>
+    <w:p/>
+    <w:p/>
+    <w:p>
+      <w:pPr>
+        <w:tabs>
+          <w:tab w:val="left" w:pos="3780"/>
+        </w:tabs>
+      </w:pPr>
+      <w:r>
+        <w:tab/>
       </w:r>
     </w:p>
     <w:sectPr>
@@ -160,6 +235,7 @@
               <w:szCs w:val="32"/>
             </w:rPr>
           </w:pPr>
+          <w:proofErr w:type="gramStart"/>
           <w:r>
             <w:rPr>
               <w:b/>
@@ -167,7 +243,17 @@
               <w:sz w:val="32"/>
               <w:szCs w:val="32"/>
             </w:rPr>
-            <w:t>{{ title }}</w:t>
+            <w:t>{{ title</w:t>
+          </w:r>
+          <w:proofErr w:type="gramEnd"/>
+          <w:r>
+            <w:rPr>
+              <w:b/>
+              <w:bCs/>
+              <w:sz w:val="32"/>
+              <w:szCs w:val="32"/>
+            </w:rPr>
+            <w:t xml:space="preserve"> }}</w:t>
           </w:r>
         </w:p>
       </w:tc>
@@ -264,8 +350,18 @@
             <w:pStyle w:val="Header"/>
             <w:spacing w:before="60" w:after="60"/>
           </w:pPr>
+          <w:proofErr w:type="gramStart"/>
           <w:r>
-            <w:t>{{ uid }}</w:t>
+            <w:t xml:space="preserve">{{ </w:t>
+          </w:r>
+          <w:proofErr w:type="spellStart"/>
+          <w:r>
+            <w:t>uid</w:t>
+          </w:r>
+          <w:proofErr w:type="spellEnd"/>
+          <w:proofErr w:type="gramEnd"/>
+          <w:r>
+            <w:t xml:space="preserve"> }}</w:t>
           </w:r>
         </w:p>
       </w:tc>
@@ -300,8 +396,13 @@
             <w:pStyle w:val="Header"/>
             <w:spacing w:before="60" w:after="60"/>
           </w:pPr>
+          <w:proofErr w:type="gramStart"/>
           <w:r>
-            <w:t>{{ rev }}</w:t>
+            <w:t>{{ rev</w:t>
+          </w:r>
+          <w:proofErr w:type="gramEnd"/>
+          <w:r>
+            <w:t xml:space="preserve"> }}</w:t>
           </w:r>
         </w:p>
       </w:tc>
@@ -354,8 +455,13 @@
             <w:pStyle w:val="Header"/>
             <w:spacing w:before="60" w:after="60"/>
           </w:pPr>
+          <w:proofErr w:type="gramStart"/>
           <w:r>
-            <w:t>{{ product }}</w:t>
+            <w:t>{{ product</w:t>
+          </w:r>
+          <w:proofErr w:type="gramEnd"/>
+          <w:r>
+            <w:t xml:space="preserve"> }}</w:t>
           </w:r>
         </w:p>
       </w:tc>
@@ -409,8 +515,13 @@
             <w:pStyle w:val="Header"/>
             <w:spacing w:before="60" w:after="60"/>
           </w:pPr>
+          <w:proofErr w:type="gramStart"/>
           <w:r>
-            <w:t>{{ date }}</w:t>
+            <w:t>{{ date</w:t>
+          </w:r>
+          <w:proofErr w:type="gramEnd"/>
+          <w:r>
+            <w:t xml:space="preserve"> }}</w:t>
           </w:r>
         </w:p>
       </w:tc>
@@ -434,53 +545,6 @@
       <w:pStyle w:val="Header"/>
       <w:jc w:val="right"/>
     </w:pPr>
-    <w:sdt>
-      <w:sdtPr>
-        <w:id w:val="-1691134828"/>
-        <w:docPartObj>
-          <w:docPartGallery w:val="Watermarks"/>
-          <w:docPartUnique/>
-        </w:docPartObj>
-      </w:sdtPr>
-      <w:sdtContent>
-        <w:r>
-          <w:rPr>
-            <w:noProof/>
-          </w:rPr>
-          <w:pict w14:anchorId="68C2F1AC">
-            <v:shapetype id="_x0000_t136" coordsize="21600,21600" o:spt="136" adj="10800" path="m@7,l@8,m@5,21600l@6,21600e">
-              <v:formulas>
-                <v:f eqn="sum #0 0 10800"/>
-                <v:f eqn="prod #0 2 1"/>
-                <v:f eqn="sum 21600 0 @1"/>
-                <v:f eqn="sum 0 0 @2"/>
-                <v:f eqn="sum 21600 0 @3"/>
-                <v:f eqn="if @0 @3 0"/>
-                <v:f eqn="if @0 21600 @1"/>
-                <v:f eqn="if @0 0 @2"/>
-                <v:f eqn="if @0 @4 21600"/>
-                <v:f eqn="mid @5 @6"/>
-                <v:f eqn="mid @8 @5"/>
-                <v:f eqn="mid @7 @8"/>
-                <v:f eqn="mid @6 @7"/>
-                <v:f eqn="sum @6 0 @5"/>
-              </v:formulas>
-              <v:path textpathok="t" o:connecttype="custom" o:connectlocs="@9,0;@10,10800;@11,21600;@12,10800" o:connectangles="270,180,90,0"/>
-              <v:textpath on="t" fitshape="t"/>
-              <v:handles>
-                <v:h position="#0,bottomRight" xrange="6629,14971"/>
-              </v:handles>
-              <o:lock v:ext="edit" text="t" shapetype="t"/>
-            </v:shapetype>
-            <v:shape id="PowerPlusWaterMarkObject357831064" o:spid="_x0000_s1025" type="#_x0000_t136" alt="" style="position:absolute;left:0;text-align:left;margin-left:0;margin-top:0;width:412.4pt;height:247.45pt;rotation:315;z-index:-251658752;mso-wrap-edited:f;mso-width-percent:0;mso-height-percent:0;mso-position-horizontal:center;mso-position-horizontal-relative:margin;mso-position-vertical:center;mso-position-vertical-relative:margin;mso-width-percent:0;mso-height-percent:0" o:allowincell="f" fillcolor="silver" stroked="f">
-              <v:fill opacity=".5"/>
-              <v:textpath style="font-family:&quot;Calibri&quot;;font-size:1pt" string="DRAFT"/>
-              <w10:wrap anchorx="margin" anchory="margin"/>
-            </v:shape>
-          </w:pict>
-        </w:r>
-      </w:sdtContent>
-    </w:sdt>
     <w:r>
       <w:t xml:space="preserve">Page </w:t>
     </w:r>

</xml_diff>

<commit_message>
fix(docs): prevent docx export corruption [GBSK-105] (#104)
## Summary
Update the documentation template DOCX so exported documentation opens
without corruption.

## Changes
- Replace the documentation template DOCX used for exports.
- Remove the draft watermark and correct the template content that
caused output corruption.

## Validation
Not provided.

OP#GBSK-105

<!-- gh-aw-workflow-id: pr-standardizer -->

Co-authored-by: Brendan Heinonen <brendan@heinonen.co>
</commit_message>
<xml_diff>
--- a/docs/template.docx
+++ b/docs/template.docx
@@ -1,6 +1,6 @@
 
 <file path=word/document.xml><?xml version="1.0" encoding="utf-8"?>
-<w:document xmlns:wpc="http://schemas.microsoft.com/office/word/2010/wordprocessingCanvas" xmlns:cx="http://schemas.microsoft.com/office/drawing/2014/chartex" xmlns:cx1="http://schemas.microsoft.com/office/drawing/2015/9/8/chartex" xmlns:cx2="http://schemas.microsoft.com/office/drawing/2015/10/21/chartex" xmlns:cx3="http://schemas.microsoft.com/office/drawing/2016/5/9/chartex" xmlns:cx4="http://schemas.microsoft.com/office/drawing/2016/5/10/chartex" xmlns:cx5="http://schemas.microsoft.com/office/drawing/2016/5/11/chartex" xmlns:cx6="http://schemas.microsoft.com/office/drawing/2016/5/12/chartex" xmlns:cx7="http://schemas.microsoft.com/office/drawing/2016/5/13/chartex" xmlns:cx8="http://schemas.microsoft.com/office/drawing/2016/5/14/chartex" xmlns:mc="http://schemas.openxmlformats.org/markup-compatibility/2006" xmlns:aink="http://schemas.microsoft.com/office/drawing/2016/ink" xmlns:am3d="http://schemas.microsoft.com/office/drawing/2017/model3d" xmlns:o="urn:schemas-microsoft-com:office:office" xmlns:oel="http://schemas.microsoft.com/office/2019/extlst" xmlns:r="http://schemas.openxmlformats.org/officeDocument/2006/relationships" xmlns:m="http://schemas.openxmlformats.org/officeDocument/2006/math" xmlns:v="urn:schemas-microsoft-com:vml" xmlns:wp14="http://schemas.microsoft.com/office/word/2010/wordprocessingDrawing" xmlns:wp="http://schemas.openxmlformats.org/drawingml/2006/wordprocessingDrawing" xmlns:w10="urn:schemas-microsoft-com:office:word" xmlns:w="http://schemas.openxmlformats.org/wordprocessingml/2006/main" xmlns:w14="http://schemas.microsoft.com/office/word/2010/wordml" xmlns:w15="http://schemas.microsoft.com/office/word/2012/wordml" xmlns:w16cex="http://schemas.microsoft.com/office/word/2018/wordml/cex" xmlns:w16cid="http://schemas.microsoft.com/office/word/2016/wordml/cid" xmlns:w16="http://schemas.microsoft.com/office/word/2018/wordml" xmlns:w16du="http://schemas.microsoft.com/office/word/2023/wordml/word16du" xmlns:w16sdtdh="http://schemas.microsoft.com/office/word/2020/wordml/sdtdatahash" xmlns:w16sdtfl="http://schemas.microsoft.com/office/word/2024/wordml/sdtformatlock" xmlns:w16se="http://schemas.microsoft.com/office/word/2015/wordml/symex" xmlns:wpg="http://schemas.microsoft.com/office/word/2010/wordprocessingGroup" xmlns:wpi="http://schemas.microsoft.com/office/word/2010/wordprocessingInk" xmlns:wne="http://schemas.microsoft.com/office/word/2006/wordml" xmlns:wps="http://schemas.microsoft.com/office/word/2010/wordprocessingShape" mc:Ignorable="w14 w15 w16se w16cid w16 w16cex w16sdtdh w16sdtfl w16du wp14">
+<w:document xmlns:wpc="http://schemas.microsoft.com/office/word/2010/wordprocessingCanvas" xmlns:cx="http://schemas.microsoft.com/office/drawing/2014/chartex" xmlns:cx1="http://schemas.microsoft.com/office/drawing/2015/9/8/chartex" xmlns:cx2="http://schemas.microsoft.com/office/drawing/2015/10/21/chartex" xmlns:cx3="http://schemas.microsoft.com/office/drawing/2016/5/9/chartex" xmlns:cx4="http://schemas.microsoft.com/office/drawing/2016/5/10/chartex" xmlns:cx5="http://schemas.microsoft.com/office/drawing/2016/5/11/chartex" xmlns:cx6="http://schemas.microsoft.com/office/drawing/2016/5/12/chartex" xmlns:cx7="http://schemas.microsoft.com/office/drawing/2016/5/13/chartex" xmlns:cx8="http://schemas.microsoft.com/office/drawing/2016/5/14/chartex" xmlns:mc="http://schemas.openxmlformats.org/markup-compatibility/2006" xmlns:aink="http://schemas.microsoft.com/office/drawing/2016/ink" xmlns:am3d="http://schemas.microsoft.com/office/drawing/2017/model3d" xmlns:o="urn:schemas-microsoft-com:office:office" xmlns:oel="http://schemas.microsoft.com/office/2019/extlst" xmlns:r="http://schemas.openxmlformats.org/officeDocument/2006/relationships" xmlns:m="http://schemas.openxmlformats.org/officeDocument/2006/math" xmlns:v="urn:schemas-microsoft-com:vml" xmlns:wp14="http://schemas.microsoft.com/office/word/2010/wordprocessingDrawing" xmlns:wp="http://schemas.openxmlformats.org/drawingml/2006/wordprocessingDrawing" xmlns:w10="urn:schemas-microsoft-com:office:word" xmlns:w="http://schemas.openxmlformats.org/wordprocessingml/2006/main" xmlns:w14="http://schemas.microsoft.com/office/word/2010/wordml" xmlns:w15="http://schemas.microsoft.com/office/word/2012/wordml" xmlns:w16cex="http://schemas.microsoft.com/office/word/2018/wordml/cex" xmlns:w16cid="http://schemas.microsoft.com/office/word/2016/wordml/cid" xmlns:w16="http://schemas.microsoft.com/office/word/2018/wordml" xmlns:w16du="http://schemas.microsoft.com/office/word/2023/wordml/word16du" xmlns:w16sdtdh="http://schemas.microsoft.com/office/word/2020/wordml/sdtdatahash" xmlns:w16sdtfl="http://schemas.microsoft.com/office/word/2024/wordml/sdtformatlock" xmlns:w16se="http://schemas.microsoft.com/office/word/2015/wordml/symex" xmlns:wpg="http://schemas.microsoft.com/office/word/2010/wordprocessingGroup" xmlns:wpi="http://schemas.microsoft.com/office/word/2010/wordprocessingInk" xmlns:wne="http://schemas.microsoft.com/office/word/2006/wordml" xmlns:wps="http://schemas.microsoft.com/office/word/2010/wordprocessingShape" xmlns:a="http://schemas.openxmlformats.org/drawingml/2006/main" xmlns:pic="http://schemas.openxmlformats.org/drawingml/2006/picture" mc:Ignorable="w14 w15 w16se w16cid w16 w16cex w16sdtdh w16sdtfl w16du wp14">
   <w:body>
     <w:p/>
     <w:p/>
@@ -9,65 +9,32 @@
       <w:pPr>
         <w:pStyle w:val="Title"/>
       </w:pPr>
-      <w:proofErr w:type="gramStart"/>
       <w:r>
-        <w:t>{{ title</w:t>
-      </w:r>
-      <w:proofErr w:type="gramEnd"/>
-      <w:r>
-        <w:t xml:space="preserve"> }}</w:t>
+        <w:t>{{ title }}</w:t>
       </w:r>
     </w:p>
     <w:p>
       <w:pPr>
         <w:pStyle w:val="Subtitle"/>
       </w:pPr>
-      <w:proofErr w:type="gramStart"/>
       <w:r>
-        <w:t xml:space="preserve">{{ </w:t>
-      </w:r>
-      <w:proofErr w:type="spellStart"/>
-      <w:r>
-        <w:t>uid</w:t>
-      </w:r>
-      <w:proofErr w:type="spellEnd"/>
-      <w:proofErr w:type="gramEnd"/>
-      <w:r>
-        <w:t xml:space="preserve"> }} Revision </w:t>
-      </w:r>
-      <w:proofErr w:type="gramStart"/>
-      <w:r>
-        <w:t>{{ rev</w:t>
-      </w:r>
-      <w:proofErr w:type="gramEnd"/>
-      <w:r>
-        <w:t xml:space="preserve"> }}</w:t>
+        <w:t>{{ uid }} Revision {{ rev }}</w:t>
       </w:r>
     </w:p>
     <w:p>
       <w:pPr>
         <w:pStyle w:val="Subtitle"/>
       </w:pPr>
-      <w:proofErr w:type="gramStart"/>
       <w:r>
-        <w:t>{{ product</w:t>
-      </w:r>
-      <w:proofErr w:type="gramEnd"/>
-      <w:r>
-        <w:t xml:space="preserve"> }}</w:t>
+        <w:t>{{ product }}</w:t>
       </w:r>
     </w:p>
     <w:p>
       <w:pPr>
         <w:pStyle w:val="Date"/>
       </w:pPr>
-      <w:proofErr w:type="gramStart"/>
       <w:r>
-        <w:t>{{ date</w:t>
-      </w:r>
-      <w:proofErr w:type="gramEnd"/>
-      <w:r>
-        <w:t xml:space="preserve"> }}</w:t>
+        <w:t>{{ date }}</w:t>
       </w:r>
     </w:p>
     <w:p>
@@ -84,30 +51,9 @@
       <w:pPr>
         <w:pStyle w:val="BodyText"/>
       </w:pPr>
-      <w:proofErr w:type="gramStart"/>
       <w:r>
         <w:lastRenderedPageBreak/>
-        <w:t xml:space="preserve">{{ </w:t>
-      </w:r>
-      <w:proofErr w:type="spellStart"/>
-      <w:r>
-        <w:t>pandoc</w:t>
-      </w:r>
-      <w:proofErr w:type="gramEnd"/>
-      <w:r>
-        <w:t>_</w:t>
-      </w:r>
-      <w:proofErr w:type="gramStart"/>
-      <w:r>
-        <w:t>body</w:t>
-      </w:r>
-      <w:proofErr w:type="spellEnd"/>
-      <w:r>
-        <w:t xml:space="preserve"> }</w:t>
-      </w:r>
-      <w:proofErr w:type="gramEnd"/>
-      <w:r>
-        <w:t>}</w:t>
+        <w:t>{{ pandoc_body }}</w:t>
       </w:r>
     </w:p>
     <w:p>
@@ -121,27 +67,6 @@
       </w:pPr>
       <w:r>
         <w:t>&lt;end of document&gt;</w:t>
-      </w:r>
-    </w:p>
-    <w:p/>
-    <w:p/>
-    <w:p/>
-    <w:p/>
-    <w:p/>
-    <w:p/>
-    <w:p/>
-    <w:p/>
-    <w:p/>
-    <w:p/>
-    <w:p/>
-    <w:p>
-      <w:pPr>
-        <w:tabs>
-          <w:tab w:val="left" w:pos="3780"/>
-        </w:tabs>
-      </w:pPr>
-      <w:r>
-        <w:tab/>
       </w:r>
     </w:p>
     <w:sectPr>
@@ -235,7 +160,6 @@
               <w:szCs w:val="32"/>
             </w:rPr>
           </w:pPr>
-          <w:proofErr w:type="gramStart"/>
           <w:r>
             <w:rPr>
               <w:b/>
@@ -243,17 +167,7 @@
               <w:sz w:val="32"/>
               <w:szCs w:val="32"/>
             </w:rPr>
-            <w:t>{{ title</w:t>
-          </w:r>
-          <w:proofErr w:type="gramEnd"/>
-          <w:r>
-            <w:rPr>
-              <w:b/>
-              <w:bCs/>
-              <w:sz w:val="32"/>
-              <w:szCs w:val="32"/>
-            </w:rPr>
-            <w:t xml:space="preserve"> }}</w:t>
+            <w:t>{{ title }}</w:t>
           </w:r>
         </w:p>
       </w:tc>
@@ -350,18 +264,8 @@
             <w:pStyle w:val="Header"/>
             <w:spacing w:before="60" w:after="60"/>
           </w:pPr>
-          <w:proofErr w:type="gramStart"/>
           <w:r>
-            <w:t xml:space="preserve">{{ </w:t>
-          </w:r>
-          <w:proofErr w:type="spellStart"/>
-          <w:r>
-            <w:t>uid</w:t>
-          </w:r>
-          <w:proofErr w:type="spellEnd"/>
-          <w:proofErr w:type="gramEnd"/>
-          <w:r>
-            <w:t xml:space="preserve"> }}</w:t>
+            <w:t>{{ uid }}</w:t>
           </w:r>
         </w:p>
       </w:tc>
@@ -396,13 +300,8 @@
             <w:pStyle w:val="Header"/>
             <w:spacing w:before="60" w:after="60"/>
           </w:pPr>
-          <w:proofErr w:type="gramStart"/>
           <w:r>
-            <w:t>{{ rev</w:t>
-          </w:r>
-          <w:proofErr w:type="gramEnd"/>
-          <w:r>
-            <w:t xml:space="preserve"> }}</w:t>
+            <w:t>{{ rev }}</w:t>
           </w:r>
         </w:p>
       </w:tc>
@@ -455,13 +354,8 @@
             <w:pStyle w:val="Header"/>
             <w:spacing w:before="60" w:after="60"/>
           </w:pPr>
-          <w:proofErr w:type="gramStart"/>
           <w:r>
-            <w:t>{{ product</w:t>
-          </w:r>
-          <w:proofErr w:type="gramEnd"/>
-          <w:r>
-            <w:t xml:space="preserve"> }}</w:t>
+            <w:t>{{ product }}</w:t>
           </w:r>
         </w:p>
       </w:tc>
@@ -515,13 +409,8 @@
             <w:pStyle w:val="Header"/>
             <w:spacing w:before="60" w:after="60"/>
           </w:pPr>
-          <w:proofErr w:type="gramStart"/>
           <w:r>
-            <w:t>{{ date</w:t>
-          </w:r>
-          <w:proofErr w:type="gramEnd"/>
-          <w:r>
-            <w:t xml:space="preserve"> }}</w:t>
+            <w:t>{{ date }}</w:t>
           </w:r>
         </w:p>
       </w:tc>
@@ -545,6 +434,53 @@
       <w:pStyle w:val="Header"/>
       <w:jc w:val="right"/>
     </w:pPr>
+    <w:sdt>
+      <w:sdtPr>
+        <w:id w:val="-1691134828"/>
+        <w:docPartObj>
+          <w:docPartGallery w:val="Watermarks"/>
+          <w:docPartUnique/>
+        </w:docPartObj>
+      </w:sdtPr>
+      <w:sdtContent>
+        <w:r>
+          <w:rPr>
+            <w:noProof/>
+          </w:rPr>
+          <w:pict w14:anchorId="68C2F1AC">
+            <v:shapetype id="_x0000_t136" coordsize="21600,21600" o:spt="136" adj="10800" path="m@7,l@8,m@5,21600l@6,21600e">
+              <v:formulas>
+                <v:f eqn="sum #0 0 10800"/>
+                <v:f eqn="prod #0 2 1"/>
+                <v:f eqn="sum 21600 0 @1"/>
+                <v:f eqn="sum 0 0 @2"/>
+                <v:f eqn="sum 21600 0 @3"/>
+                <v:f eqn="if @0 @3 0"/>
+                <v:f eqn="if @0 21600 @1"/>
+                <v:f eqn="if @0 0 @2"/>
+                <v:f eqn="if @0 @4 21600"/>
+                <v:f eqn="mid @5 @6"/>
+                <v:f eqn="mid @8 @5"/>
+                <v:f eqn="mid @7 @8"/>
+                <v:f eqn="mid @6 @7"/>
+                <v:f eqn="sum @6 0 @5"/>
+              </v:formulas>
+              <v:path textpathok="t" o:connecttype="custom" o:connectlocs="@9,0;@10,10800;@11,21600;@12,10800" o:connectangles="270,180,90,0"/>
+              <v:textpath on="t" fitshape="t"/>
+              <v:handles>
+                <v:h position="#0,bottomRight" xrange="6629,14971"/>
+              </v:handles>
+              <o:lock v:ext="edit" text="t" shapetype="t"/>
+            </v:shapetype>
+            <v:shape id="PowerPlusWaterMarkObject357831064" o:spid="_x0000_s1025" type="#_x0000_t136" alt="" style="position:absolute;left:0;text-align:left;margin-left:0;margin-top:0;width:412.4pt;height:247.45pt;rotation:315;z-index:-251658752;mso-wrap-edited:f;mso-width-percent:0;mso-height-percent:0;mso-position-horizontal:center;mso-position-horizontal-relative:margin;mso-position-vertical:center;mso-position-vertical-relative:margin;mso-width-percent:0;mso-height-percent:0" o:allowincell="f" fillcolor="silver" stroked="f">
+              <v:fill opacity=".5"/>
+              <v:textpath style="font-family:&quot;Calibri&quot;;font-size:1pt" string=""/>
+              <w10:wrap anchorx="margin" anchory="margin"/>
+            </v:shape>
+          </w:pict>
+        </w:r>
+      </w:sdtContent>
+    </w:sdt>
     <w:r>
       <w:t xml:space="preserve">Page </w:t>
     </w:r>

</xml_diff>